<commit_message>
docs: format MoE brief report as eight-page A4
Co-authored-by: Tao Gao <taogao1991@outlook.com>
</commit_message>
<xml_diff>
--- a/docs/supernode-scale/稀疏模型超节点规模需求分析_精华版.docx
+++ b/docs/supernode-scale/稀疏模型超节点规模需求分析_精华版.docx
@@ -5081,7 +5081,10 @@
     </w:p>
     <w:bookmarkEnd w:id="50"/>
     <w:bookmarkEnd w:id="51"/>
-    <w:sectPr/>
+    <w:sectPr>
+      <w:pgSz w:h="16838" w:w="11906"/>
+      <w:pgMar w:bottom="907" w:left="1020" w:right="1020" w:top="907"/>
+    </w:sectPr>
   </w:body>
 </w:document>
 </file>
@@ -5459,6 +5462,14 @@
   <w:style w:default="1" w:styleId="Normal" w:type="paragraph">
     <w:name w:val="Normal"/>
     <w:qFormat/>
+    <w:pPr>
+      <w:spacing w:after="60" w:line="252" w:lineRule="auto"/>
+    </w:pPr>
+    <w:rPr>
+      <w:rFonts w:ascii="Arial" w:eastAsia="Microsoft YaHei" w:hAnsi="Arial"/>
+      <w:b w:val="0"/>
+      <w:sz w:val="21"/>
+    </w:rPr>
   </w:style>
   <w:style w:styleId="BodyText" w:type="paragraph">
     <w:name w:val="Body Text"/>
@@ -5482,6 +5493,11 @@
     <w:pPr>
       <w:spacing w:after="36" w:before="36"/>
     </w:pPr>
+    <w:rPr>
+      <w:rFonts w:ascii="Arial" w:eastAsia="Microsoft YaHei" w:hAnsi="Arial"/>
+      <w:b w:val="0"/>
+      <w:sz w:val="19"/>
+    </w:rPr>
   </w:style>
   <w:style w:styleId="Title" w:type="paragraph">
     <w:name w:val="Title"/>
@@ -5495,11 +5511,11 @@
       <w:jc w:val="center"/>
     </w:pPr>
     <w:rPr>
-      <w:rFonts w:asciiTheme="majorHAnsi" w:cstheme="majorBidi" w:eastAsiaTheme="majorEastAsia" w:hAnsiTheme="majorHAnsi"/>
+      <w:rFonts w:ascii="Arial" w:asciiTheme="majorHAnsi" w:cstheme="majorBidi" w:eastAsia="Microsoft YaHei" w:eastAsiaTheme="majorEastAsia" w:hAnsi="Arial" w:hAnsiTheme="majorHAnsi"/>
       <w:b/>
       <w:bCs/>
       <w:color w:themeColor="accent1" w:themeShade="B5" w:val="345A8A"/>
-      <w:sz w:val="36"/>
+      <w:sz w:val="40"/>
       <w:szCs w:val="36"/>
     </w:rPr>
   </w:style>
@@ -5594,11 +5610,11 @@
       <w:outlineLvl w:val="0"/>
     </w:pPr>
     <w:rPr>
-      <w:rFonts w:asciiTheme="majorHAnsi" w:cstheme="majorBidi" w:eastAsiaTheme="majorEastAsia" w:hAnsiTheme="majorHAnsi"/>
+      <w:rFonts w:ascii="Arial" w:asciiTheme="majorHAnsi" w:cstheme="majorBidi" w:eastAsia="Microsoft YaHei" w:eastAsiaTheme="majorEastAsia" w:hAnsi="Arial" w:hAnsiTheme="majorHAnsi"/>
       <w:b/>
       <w:bCs/>
       <w:color w:themeColor="accent1" w:val="4F81BD"/>
-      <w:sz w:val="32"/>
+      <w:sz w:val="30"/>
       <w:szCs w:val="32"/>
     </w:rPr>
   </w:style>
@@ -5616,11 +5632,11 @@
       <w:outlineLvl w:val="1"/>
     </w:pPr>
     <w:rPr>
-      <w:rFonts w:asciiTheme="majorHAnsi" w:cstheme="majorBidi" w:eastAsiaTheme="majorEastAsia" w:hAnsiTheme="majorHAnsi"/>
+      <w:rFonts w:ascii="Arial" w:asciiTheme="majorHAnsi" w:cstheme="majorBidi" w:eastAsia="Microsoft YaHei" w:eastAsiaTheme="majorEastAsia" w:hAnsi="Arial" w:hAnsiTheme="majorHAnsi"/>
       <w:b/>
       <w:bCs/>
       <w:color w:themeColor="accent1" w:val="4F81BD"/>
-      <w:sz w:val="28"/>
+      <w:sz w:val="26"/>
       <w:szCs w:val="28"/>
     </w:rPr>
   </w:style>
@@ -5638,11 +5654,11 @@
       <w:outlineLvl w:val="2"/>
     </w:pPr>
     <w:rPr>
-      <w:rFonts w:asciiTheme="majorHAnsi" w:cstheme="majorBidi" w:eastAsiaTheme="majorEastAsia" w:hAnsiTheme="majorHAnsi"/>
+      <w:rFonts w:ascii="Arial" w:asciiTheme="majorHAnsi" w:cstheme="majorBidi" w:eastAsia="Microsoft YaHei" w:eastAsiaTheme="majorEastAsia" w:hAnsi="Arial" w:hAnsiTheme="majorHAnsi"/>
       <w:b/>
       <w:bCs/>
       <w:color w:themeColor="accent1" w:val="4F81BD"/>
-      <w:sz w:val="24"/>
+      <w:sz w:val="22"/>
       <w:szCs w:val="24"/>
     </w:rPr>
   </w:style>
@@ -5924,7 +5940,7 @@
       <w:color w:themeColor="accent1" w:themeShade="BF" w:val="365F91"/>
     </w:rPr>
   </w:style>
-  <w:style w:type="paragraph" w:customStyle="1" w:styleId="SourceCode">
+  <w:style w:customStyle="1" w:styleId="SourceCode" w:type="paragraph">
     <w:name w:val="Source Code"/>
     <w:basedOn w:val="Normal"/>
     <w:link w:val="VerbatimChar"/>
@@ -5932,7 +5948,7 @@
       <w:wordWrap w:val="off"/>
     </w:pPr>
   </w:style>
-  <w:style w:type="character" w:customStyle="1" w:styleId="KeywordTok">
+  <w:style w:customStyle="1" w:styleId="KeywordTok" w:type="character">
     <w:name w:val="KeywordTok"/>
     <w:basedOn w:val="VerbatimChar"/>
     <w:rPr>
@@ -5940,77 +5956,77 @@
       <w:b/>
     </w:rPr>
   </w:style>
-  <w:style w:type="character" w:customStyle="1" w:styleId="DataTypeTok">
+  <w:style w:customStyle="1" w:styleId="DataTypeTok" w:type="character">
     <w:name w:val="DataTypeTok"/>
     <w:basedOn w:val="VerbatimChar"/>
     <w:rPr>
       <w:color w:val="902000"/>
     </w:rPr>
   </w:style>
-  <w:style w:type="character" w:customStyle="1" w:styleId="DecValTok">
+  <w:style w:customStyle="1" w:styleId="DecValTok" w:type="character">
     <w:name w:val="DecValTok"/>
     <w:basedOn w:val="VerbatimChar"/>
     <w:rPr>
       <w:color w:val="40a070"/>
     </w:rPr>
   </w:style>
-  <w:style w:type="character" w:customStyle="1" w:styleId="BaseNTok">
+  <w:style w:customStyle="1" w:styleId="BaseNTok" w:type="character">
     <w:name w:val="BaseNTok"/>
     <w:basedOn w:val="VerbatimChar"/>
     <w:rPr>
       <w:color w:val="40a070"/>
     </w:rPr>
   </w:style>
-  <w:style w:type="character" w:customStyle="1" w:styleId="FloatTok">
+  <w:style w:customStyle="1" w:styleId="FloatTok" w:type="character">
     <w:name w:val="FloatTok"/>
     <w:basedOn w:val="VerbatimChar"/>
     <w:rPr>
       <w:color w:val="40a070"/>
     </w:rPr>
   </w:style>
-  <w:style w:type="character" w:customStyle="1" w:styleId="ConstantTok">
+  <w:style w:customStyle="1" w:styleId="ConstantTok" w:type="character">
     <w:name w:val="ConstantTok"/>
     <w:basedOn w:val="VerbatimChar"/>
     <w:rPr>
       <w:color w:val="880000"/>
     </w:rPr>
   </w:style>
-  <w:style w:type="character" w:customStyle="1" w:styleId="CharTok">
+  <w:style w:customStyle="1" w:styleId="CharTok" w:type="character">
     <w:name w:val="CharTok"/>
     <w:basedOn w:val="VerbatimChar"/>
     <w:rPr>
       <w:color w:val="4070a0"/>
     </w:rPr>
   </w:style>
-  <w:style w:type="character" w:customStyle="1" w:styleId="SpecialCharTok">
+  <w:style w:customStyle="1" w:styleId="SpecialCharTok" w:type="character">
     <w:name w:val="SpecialCharTok"/>
     <w:basedOn w:val="VerbatimChar"/>
     <w:rPr>
       <w:color w:val="4070a0"/>
     </w:rPr>
   </w:style>
-  <w:style w:type="character" w:customStyle="1" w:styleId="StringTok">
+  <w:style w:customStyle="1" w:styleId="StringTok" w:type="character">
     <w:name w:val="StringTok"/>
     <w:basedOn w:val="VerbatimChar"/>
     <w:rPr>
       <w:color w:val="4070a0"/>
     </w:rPr>
   </w:style>
-  <w:style w:type="character" w:customStyle="1" w:styleId="VerbatimStringTok">
+  <w:style w:customStyle="1" w:styleId="VerbatimStringTok" w:type="character">
     <w:name w:val="VerbatimStringTok"/>
     <w:basedOn w:val="VerbatimChar"/>
     <w:rPr>
       <w:color w:val="4070a0"/>
     </w:rPr>
   </w:style>
-  <w:style w:type="character" w:customStyle="1" w:styleId="SpecialStringTok">
+  <w:style w:customStyle="1" w:styleId="SpecialStringTok" w:type="character">
     <w:name w:val="SpecialStringTok"/>
     <w:basedOn w:val="VerbatimChar"/>
     <w:rPr>
       <w:color w:val="bb6688"/>
     </w:rPr>
   </w:style>
-  <w:style w:type="character" w:customStyle="1" w:styleId="ImportTok">
+  <w:style w:customStyle="1" w:styleId="ImportTok" w:type="character">
     <w:name w:val="ImportTok"/>
     <w:basedOn w:val="VerbatimChar"/>
     <w:rPr>
@@ -6018,7 +6034,7 @@
       <w:b/>
     </w:rPr>
   </w:style>
-  <w:style w:type="character" w:customStyle="1" w:styleId="CommentTok">
+  <w:style w:customStyle="1" w:styleId="CommentTok" w:type="character">
     <w:name w:val="CommentTok"/>
     <w:basedOn w:val="VerbatimChar"/>
     <w:rPr>
@@ -6026,7 +6042,7 @@
       <w:i/>
     </w:rPr>
   </w:style>
-  <w:style w:type="character" w:customStyle="1" w:styleId="DocumentationTok">
+  <w:style w:customStyle="1" w:styleId="DocumentationTok" w:type="character">
     <w:name w:val="DocumentationTok"/>
     <w:basedOn w:val="VerbatimChar"/>
     <w:rPr>
@@ -6034,7 +6050,7 @@
       <w:i/>
     </w:rPr>
   </w:style>
-  <w:style w:type="character" w:customStyle="1" w:styleId="AnnotationTok">
+  <w:style w:customStyle="1" w:styleId="AnnotationTok" w:type="character">
     <w:name w:val="AnnotationTok"/>
     <w:basedOn w:val="VerbatimChar"/>
     <w:rPr>
@@ -6043,7 +6059,7 @@
       <w:i/>
     </w:rPr>
   </w:style>
-  <w:style w:type="character" w:customStyle="1" w:styleId="CommentVarTok">
+  <w:style w:customStyle="1" w:styleId="CommentVarTok" w:type="character">
     <w:name w:val="CommentVarTok"/>
     <w:basedOn w:val="VerbatimChar"/>
     <w:rPr>
@@ -6052,28 +6068,28 @@
       <w:i/>
     </w:rPr>
   </w:style>
-  <w:style w:type="character" w:customStyle="1" w:styleId="OtherTok">
+  <w:style w:customStyle="1" w:styleId="OtherTok" w:type="character">
     <w:name w:val="OtherTok"/>
     <w:basedOn w:val="VerbatimChar"/>
     <w:rPr>
       <w:color w:val="007020"/>
     </w:rPr>
   </w:style>
-  <w:style w:type="character" w:customStyle="1" w:styleId="FunctionTok">
+  <w:style w:customStyle="1" w:styleId="FunctionTok" w:type="character">
     <w:name w:val="FunctionTok"/>
     <w:basedOn w:val="VerbatimChar"/>
     <w:rPr>
       <w:color w:val="06287e"/>
     </w:rPr>
   </w:style>
-  <w:style w:type="character" w:customStyle="1" w:styleId="VariableTok">
+  <w:style w:customStyle="1" w:styleId="VariableTok" w:type="character">
     <w:name w:val="VariableTok"/>
     <w:basedOn w:val="VerbatimChar"/>
     <w:rPr>
       <w:color w:val="19177c"/>
     </w:rPr>
   </w:style>
-  <w:style w:type="character" w:customStyle="1" w:styleId="ControlFlowTok">
+  <w:style w:customStyle="1" w:styleId="ControlFlowTok" w:type="character">
     <w:name w:val="ControlFlowTok"/>
     <w:basedOn w:val="VerbatimChar"/>
     <w:rPr>
@@ -6081,45 +6097,45 @@
       <w:b/>
     </w:rPr>
   </w:style>
-  <w:style w:type="character" w:customStyle="1" w:styleId="OperatorTok">
+  <w:style w:customStyle="1" w:styleId="OperatorTok" w:type="character">
     <w:name w:val="OperatorTok"/>
     <w:basedOn w:val="VerbatimChar"/>
     <w:rPr>
       <w:color w:val="666666"/>
     </w:rPr>
   </w:style>
-  <w:style w:type="character" w:customStyle="1" w:styleId="BuiltInTok">
+  <w:style w:customStyle="1" w:styleId="BuiltInTok" w:type="character">
     <w:name w:val="BuiltInTok"/>
     <w:basedOn w:val="VerbatimChar"/>
     <w:rPr>
       <w:color w:val="008000"/>
     </w:rPr>
   </w:style>
-  <w:style w:type="character" w:customStyle="1" w:styleId="ExtensionTok">
+  <w:style w:customStyle="1" w:styleId="ExtensionTok" w:type="character">
     <w:name w:val="ExtensionTok"/>
     <w:basedOn w:val="VerbatimChar"/>
     <w:rPr/>
   </w:style>
-  <w:style w:type="character" w:customStyle="1" w:styleId="PreprocessorTok">
+  <w:style w:customStyle="1" w:styleId="PreprocessorTok" w:type="character">
     <w:name w:val="PreprocessorTok"/>
     <w:basedOn w:val="VerbatimChar"/>
     <w:rPr>
       <w:color w:val="bc7a00"/>
     </w:rPr>
   </w:style>
-  <w:style w:type="character" w:customStyle="1" w:styleId="AttributeTok">
+  <w:style w:customStyle="1" w:styleId="AttributeTok" w:type="character">
     <w:name w:val="AttributeTok"/>
     <w:basedOn w:val="VerbatimChar"/>
     <w:rPr>
       <w:color w:val="7d9029"/>
     </w:rPr>
   </w:style>
-  <w:style w:type="character" w:customStyle="1" w:styleId="RegionMarkerTok">
+  <w:style w:customStyle="1" w:styleId="RegionMarkerTok" w:type="character">
     <w:name w:val="RegionMarkerTok"/>
     <w:basedOn w:val="VerbatimChar"/>
     <w:rPr/>
   </w:style>
-  <w:style w:type="character" w:customStyle="1" w:styleId="InformationTok">
+  <w:style w:customStyle="1" w:styleId="InformationTok" w:type="character">
     <w:name w:val="InformationTok"/>
     <w:basedOn w:val="VerbatimChar"/>
     <w:rPr>
@@ -6128,7 +6144,7 @@
       <w:i/>
     </w:rPr>
   </w:style>
-  <w:style w:type="character" w:customStyle="1" w:styleId="WarningTok">
+  <w:style w:customStyle="1" w:styleId="WarningTok" w:type="character">
     <w:name w:val="WarningTok"/>
     <w:basedOn w:val="VerbatimChar"/>
     <w:rPr>
@@ -6137,7 +6153,7 @@
       <w:i/>
     </w:rPr>
   </w:style>
-  <w:style w:type="character" w:customStyle="1" w:styleId="AlertTok">
+  <w:style w:customStyle="1" w:styleId="AlertTok" w:type="character">
     <w:name w:val="AlertTok"/>
     <w:basedOn w:val="VerbatimChar"/>
     <w:rPr>
@@ -6145,7 +6161,7 @@
       <w:b/>
     </w:rPr>
   </w:style>
-  <w:style w:type="character" w:customStyle="1" w:styleId="ErrorTok">
+  <w:style w:customStyle="1" w:styleId="ErrorTok" w:type="character">
     <w:name w:val="ErrorTok"/>
     <w:basedOn w:val="VerbatimChar"/>
     <w:rPr>
@@ -6153,7 +6169,7 @@
       <w:b/>
     </w:rPr>
   </w:style>
-  <w:style w:type="character" w:customStyle="1" w:styleId="NormalTok">
+  <w:style w:customStyle="1" w:styleId="NormalTok" w:type="character">
     <w:name w:val="NormalTok"/>
     <w:basedOn w:val="VerbatimChar"/>
     <w:rPr/>

</xml_diff>

<commit_message>
docs: link MoE brief to full report
Co-authored-by: Tao Gao <taogao1991@outlook.com>
</commit_message>
<xml_diff>
--- a/docs/supernode-scale/稀疏模型超节点规模需求分析_精华版.docx
+++ b/docs/supernode-scale/稀疏模型超节点规模需求分析_精华版.docx
@@ -28,7 +28,7 @@
         </w:p>
       </w:sdtContent>
     </w:sdt>
-    <w:bookmarkStart w:id="51" w:name="稀疏大模型负载驱动的昇腾超节点规模需求分析"/>
+    <w:bookmarkStart w:id="52" w:name="稀疏大模型负载驱动的昇腾超节点规模需求分析"/>
     <w:p>
       <w:pPr>
         <w:pStyle w:val="Heading1"/>
@@ -4926,7 +4926,7 @@
     </w:p>
     <w:bookmarkEnd w:id="40"/>
     <w:bookmarkEnd w:id="41"/>
-    <w:bookmarkStart w:id="50" w:name="资料来源"/>
+    <w:bookmarkStart w:id="51" w:name="资料来源"/>
     <w:p>
       <w:pPr>
         <w:pStyle w:val="Heading2"/>
@@ -5076,11 +5076,22 @@
         <w:pStyle w:val="BlockText"/>
       </w:pPr>
       <w:r>
-        <w:t xml:space="preserve">完整推导、公式边界和Benchmark清单见同目录完整版报告。</w:t>
-      </w:r>
-    </w:p>
-    <w:bookmarkEnd w:id="50"/>
+        <w:t xml:space="preserve">完整推导、公式边界和Benchmark清单见同目录</w:t>
+      </w:r>
+      <w:hyperlink r:id="rId50">
+        <w:r>
+          <w:rPr>
+            <w:rStyle w:val="Hyperlink"/>
+          </w:rPr>
+          <w:t xml:space="preserve">完整版报告</w:t>
+        </w:r>
+      </w:hyperlink>
+      <w:r>
+        <w:t xml:space="preserve">。</w:t>
+      </w:r>
+    </w:p>
     <w:bookmarkEnd w:id="51"/>
+    <w:bookmarkEnd w:id="52"/>
     <w:sectPr>
       <w:pgSz w:h="16838" w:w="11906"/>
       <w:pgMar w:bottom="907" w:left="1020" w:right="1020" w:top="907"/>

</xml_diff>

<commit_message>
docs: correct MoE brief formulas and examples
Co-authored-by: Tao Gao <taogao1991@outlook.com>
</commit_message>
<xml_diff>
--- a/docs/supernode-scale/稀疏模型超节点规模需求分析_精华版.docx
+++ b/docs/supernode-scale/稀疏模型超节点规模需求分析_精华版.docx
@@ -956,168 +956,194 @@
           <m:jc m:val="center"/>
         </m:oMathParaPr>
         <m:oMath>
-          <m:sSub>
-            <m:e>
-              <m:r>
-                <m:t>P</m:t>
-              </m:r>
-            </m:e>
-            <m:sub>
-              <m:r>
-                <m:rPr>
-                  <m:nor/>
-                  <m:sty m:val="p"/>
-                </m:rPr>
-                <m:t>total</m:t>
-              </m:r>
-            </m:sub>
-          </m:sSub>
-          <m:r>
-            <m:rPr>
-              <m:sty m:val="p"/>
-            </m:rPr>
-            <m:t>≈</m:t>
-          </m:r>
-          <m:sSub>
-            <m:e>
-              <m:r>
-                <m:t>P</m:t>
-              </m:r>
-            </m:e>
-            <m:sub>
-              <m:r>
-                <m:rPr>
-                  <m:nor/>
-                  <m:sty m:val="p"/>
-                </m:rPr>
-                <m:t>nonexpert</m:t>
-              </m:r>
-            </m:sub>
-          </m:sSub>
-          <m:r>
-            <m:rPr>
-              <m:sty m:val="p"/>
-            </m:rPr>
-            <m:t>+</m:t>
-          </m:r>
-          <m:sSub>
-            <m:e>
-              <m:r>
-                <m:t>L</m:t>
-              </m:r>
-            </m:e>
-            <m:sub>
-              <m:r>
-                <m:rPr>
-                  <m:nor/>
-                  <m:sty m:val="p"/>
-                </m:rPr>
-                <m:t>MoE</m:t>
-              </m:r>
-            </m:sub>
-          </m:sSub>
-          <m:r>
-            <m:t>E</m:t>
-          </m:r>
-          <m:sSub>
-            <m:e>
-              <m:r>
-                <m:t>P</m:t>
-              </m:r>
-            </m:e>
-            <m:sub>
-              <m:r>
-                <m:t>x</m:t>
-              </m:r>
-            </m:sub>
-          </m:sSub>
-        </m:oMath>
-      </m:oMathPara>
-    </w:p>
-    <w:p>
-      <w:pPr>
-        <w:pStyle w:val="FirstParagraph"/>
-      </w:pPr>
-      <m:oMathPara>
-        <m:oMathParaPr>
-          <m:jc m:val="center"/>
-        </m:oMathParaPr>
-        <m:oMath>
-          <m:sSub>
-            <m:e>
-              <m:r>
-                <m:t>P</m:t>
-              </m:r>
-            </m:e>
-            <m:sub>
-              <m:r>
-                <m:rPr>
-                  <m:nor/>
-                  <m:sty m:val="p"/>
-                </m:rPr>
-                <m:t>active</m:t>
-              </m:r>
-            </m:sub>
-          </m:sSub>
-          <m:r>
-            <m:rPr>
-              <m:sty m:val="p"/>
-            </m:rPr>
-            <m:t>≈</m:t>
-          </m:r>
-          <m:sSub>
-            <m:e>
-              <m:r>
-                <m:t>P</m:t>
-              </m:r>
-            </m:e>
-            <m:sub>
-              <m:r>
-                <m:rPr>
-                  <m:nor/>
-                  <m:sty m:val="p"/>
-                </m:rPr>
-                <m:t>nonexpert</m:t>
-              </m:r>
-            </m:sub>
-          </m:sSub>
-          <m:r>
-            <m:rPr>
-              <m:sty m:val="p"/>
-            </m:rPr>
-            <m:t>+</m:t>
-          </m:r>
-          <m:sSub>
-            <m:e>
-              <m:r>
-                <m:t>L</m:t>
-              </m:r>
-            </m:e>
-            <m:sub>
-              <m:r>
-                <m:rPr>
-                  <m:nor/>
-                  <m:sty m:val="p"/>
-                </m:rPr>
-                <m:t>MoE</m:t>
-              </m:r>
-            </m:sub>
-          </m:sSub>
-          <m:r>
-            <m:t>K</m:t>
-          </m:r>
-          <m:sSub>
-            <m:e>
-              <m:r>
-                <m:t>P</m:t>
-              </m:r>
-            </m:e>
-            <m:sub>
-              <m:r>
-                <m:t>x</m:t>
-              </m:r>
-            </m:sub>
-          </m:sSub>
+          <m:m>
+            <m:mPr>
+              <m:baseJc m:val="center"/>
+              <m:plcHide m:val="on"/>
+              <m:mcs>
+                <m:mc>
+                  <m:mcPr>
+                    <m:mcJc m:val="right"/>
+                    <m:count m:val="1"/>
+                  </m:mcPr>
+                </m:mc>
+                <m:mc>
+                  <m:mcPr>
+                    <m:mcJc m:val="left"/>
+                    <m:count m:val="1"/>
+                  </m:mcPr>
+                </m:mc>
+              </m:mcs>
+            </m:mPr>
+            <m:mr>
+              <m:e>
+                <m:sSub>
+                  <m:e>
+                    <m:r>
+                      <m:t>P</m:t>
+                    </m:r>
+                  </m:e>
+                  <m:sub>
+                    <m:r>
+                      <m:rPr>
+                        <m:nor/>
+                        <m:sty m:val="p"/>
+                      </m:rPr>
+                      <m:t>total</m:t>
+                    </m:r>
+                  </m:sub>
+                </m:sSub>
+              </m:e>
+              <m:e>
+                <m:r>
+                  <m:rPr>
+                    <m:sty m:val="p"/>
+                  </m:rPr>
+                  <m:t>≈</m:t>
+                </m:r>
+                <m:sSub>
+                  <m:e>
+                    <m:r>
+                      <m:t>P</m:t>
+                    </m:r>
+                  </m:e>
+                  <m:sub>
+                    <m:r>
+                      <m:rPr>
+                        <m:nor/>
+                        <m:sty m:val="p"/>
+                      </m:rPr>
+                      <m:t>nonexpert</m:t>
+                    </m:r>
+                  </m:sub>
+                </m:sSub>
+                <m:r>
+                  <m:rPr>
+                    <m:sty m:val="p"/>
+                  </m:rPr>
+                  <m:t>+</m:t>
+                </m:r>
+                <m:sSub>
+                  <m:e>
+                    <m:r>
+                      <m:t>L</m:t>
+                    </m:r>
+                  </m:e>
+                  <m:sub>
+                    <m:r>
+                      <m:rPr>
+                        <m:nor/>
+                        <m:sty m:val="p"/>
+                      </m:rPr>
+                      <m:t>MoE</m:t>
+                    </m:r>
+                  </m:sub>
+                </m:sSub>
+                <m:r>
+                  <m:t>E</m:t>
+                </m:r>
+                <m:sSub>
+                  <m:e>
+                    <m:r>
+                      <m:t>P</m:t>
+                    </m:r>
+                  </m:e>
+                  <m:sub>
+                    <m:r>
+                      <m:t>x</m:t>
+                    </m:r>
+                  </m:sub>
+                </m:sSub>
+                <m:r>
+                  <m:rPr>
+                    <m:sty m:val="p"/>
+                  </m:rPr>
+                  <m:t>,</m:t>
+                </m:r>
+              </m:e>
+            </m:mr>
+            <m:mr>
+              <m:e>
+                <m:sSub>
+                  <m:e>
+                    <m:r>
+                      <m:t>P</m:t>
+                    </m:r>
+                  </m:e>
+                  <m:sub>
+                    <m:r>
+                      <m:rPr>
+                        <m:nor/>
+                        <m:sty m:val="p"/>
+                      </m:rPr>
+                      <m:t>active</m:t>
+                    </m:r>
+                  </m:sub>
+                </m:sSub>
+              </m:e>
+              <m:e>
+                <m:r>
+                  <m:rPr>
+                    <m:sty m:val="p"/>
+                  </m:rPr>
+                  <m:t>≈</m:t>
+                </m:r>
+                <m:sSub>
+                  <m:e>
+                    <m:r>
+                      <m:t>P</m:t>
+                    </m:r>
+                  </m:e>
+                  <m:sub>
+                    <m:r>
+                      <m:rPr>
+                        <m:nor/>
+                        <m:sty m:val="p"/>
+                      </m:rPr>
+                      <m:t>nonexpert</m:t>
+                    </m:r>
+                  </m:sub>
+                </m:sSub>
+                <m:r>
+                  <m:rPr>
+                    <m:sty m:val="p"/>
+                  </m:rPr>
+                  <m:t>+</m:t>
+                </m:r>
+                <m:sSub>
+                  <m:e>
+                    <m:r>
+                      <m:t>L</m:t>
+                    </m:r>
+                  </m:e>
+                  <m:sub>
+                    <m:r>
+                      <m:rPr>
+                        <m:nor/>
+                        <m:sty m:val="p"/>
+                      </m:rPr>
+                      <m:t>MoE</m:t>
+                    </m:r>
+                  </m:sub>
+                </m:sSub>
+                <m:r>
+                  <m:t>K</m:t>
+                </m:r>
+                <m:sSub>
+                  <m:e>
+                    <m:r>
+                      <m:t>P</m:t>
+                    </m:r>
+                  </m:e>
+                  <m:sub>
+                    <m:r>
+                      <m:t>x</m:t>
+                    </m:r>
+                  </m:sub>
+                </m:sSub>
+              </m:e>
+            </m:mr>
+          </m:m>
         </m:oMath>
       </m:oMathPara>
     </w:p>
@@ -1996,7 +2022,7 @@
         <w:pStyle w:val="FirstParagraph"/>
       </w:pPr>
       <w:r>
-        <w:t xml:space="preserve">式（5）表示EP组级远端Payload。单Rank平均发送量还需除以EP；Fabric实际流量还受到路由跳数、协议和拥塞影响。</w:t>
+        <w:t xml:space="preserve">式（5）表示EP组级前向远端Payload。训练反向还需传输相应梯度，理想情况下前向加反向的总Payload约为式（5）的2倍。单Rank平均发送量还需除以EP，但热门专家所在Rank的峰值接收量可能显著高于平均值；Fabric实际流量还受到路由跳数、协议和拥塞影响。</w:t>
       </w:r>
     </w:p>
     <w:bookmarkEnd w:id="24"/>
@@ -2648,70 +2674,66 @@
         <w:pStyle w:val="FirstParagraph"/>
       </w:pPr>
       <w:r>
-        <w:t xml:space="preserve">全部专家通常需要驻留在HBM或可接受的分层内存中。推理权重容量近似为：</w:t>
+        <w:t xml:space="preserve">全部专家通常需要驻留在HBM或可接受的分层内存中。推理权重容量近似为</w:t>
+      </w:r>
+      <w:r>
+        <w:t xml:space="preserve"> </w:t>
+      </w:r>
+      <m:oMath>
+        <m:sSub>
+          <m:e>
+            <m:r>
+              <m:t>M</m:t>
+            </m:r>
+          </m:e>
+          <m:sub>
+            <m:r>
+              <m:t>W</m:t>
+            </m:r>
+          </m:sub>
+        </m:sSub>
+        <m:r>
+          <m:rPr>
+            <m:sty m:val="p"/>
+          </m:rPr>
+          <m:t>≈</m:t>
+        </m:r>
+        <m:sSub>
+          <m:e>
+            <m:r>
+              <m:t>P</m:t>
+            </m:r>
+          </m:e>
+          <m:sub>
+            <m:r>
+              <m:rPr>
+                <m:nor/>
+                <m:sty m:val="p"/>
+              </m:rPr>
+              <m:t>total</m:t>
+            </m:r>
+          </m:sub>
+        </m:sSub>
+        <m:sSub>
+          <m:e>
+            <m:r>
+              <m:t>b</m:t>
+            </m:r>
+          </m:e>
+          <m:sub>
+            <m:r>
+              <m:t>w</m:t>
+            </m:r>
+          </m:sub>
+        </m:sSub>
+      </m:oMath>
+      <w:r>
+        <w:t xml:space="preserve">。</w:t>
       </w:r>
     </w:p>
     <w:p>
       <w:pPr>
         <w:pStyle w:val="BodyText"/>
-      </w:pPr>
-      <m:oMathPara>
-        <m:oMathParaPr>
-          <m:jc m:val="center"/>
-        </m:oMathParaPr>
-        <m:oMath>
-          <m:sSub>
-            <m:e>
-              <m:r>
-                <m:t>M</m:t>
-              </m:r>
-            </m:e>
-            <m:sub>
-              <m:r>
-                <m:t>W</m:t>
-              </m:r>
-            </m:sub>
-          </m:sSub>
-          <m:r>
-            <m:rPr>
-              <m:sty m:val="p"/>
-            </m:rPr>
-            <m:t>≈</m:t>
-          </m:r>
-          <m:sSub>
-            <m:e>
-              <m:r>
-                <m:t>P</m:t>
-              </m:r>
-            </m:e>
-            <m:sub>
-              <m:r>
-                <m:rPr>
-                  <m:nor/>
-                  <m:sty m:val="p"/>
-                </m:rPr>
-                <m:t>total</m:t>
-              </m:r>
-            </m:sub>
-          </m:sSub>
-          <m:sSub>
-            <m:e>
-              <m:r>
-                <m:t>b</m:t>
-              </m:r>
-            </m:e>
-            <m:sub>
-              <m:r>
-                <m:t>w</m:t>
-              </m:r>
-            </m:sub>
-          </m:sSub>
-        </m:oMath>
-      </m:oMathPara>
-    </w:p>
-    <w:p>
-      <w:pPr>
-        <w:pStyle w:val="FirstParagraph"/>
       </w:pPr>
       <w:r>
         <w:t xml:space="preserve">量化后仍需加入Scale、Zero Point、Padding、未量化层和反量化Workspace。MoE每轮实际读取的专家权重由Batch内访问专家的并集决定，不能直接使用单Token激活参数估算HBM流量。</w:t>
@@ -2829,206 +2851,201 @@
           <m:jc m:val="center"/>
         </m:oMathParaPr>
         <m:oMath>
-          <m:sSub>
-            <m:e>
-              <m:r>
-                <m:t>m</m:t>
-              </m:r>
-            </m:e>
-            <m:sub>
-              <m:r>
-                <m:rPr>
-                  <m:nor/>
-                  <m:sty m:val="p"/>
-                </m:rPr>
-                <m:t>KV/token</m:t>
-              </m:r>
-            </m:sub>
-          </m:sSub>
-          <m:r>
-            <m:rPr>
-              <m:sty m:val="p"/>
-            </m:rPr>
-            <m:t>=</m:t>
-          </m:r>
-          <m:r>
-            <m:t>2</m:t>
-          </m:r>
-          <m:r>
-            <m:t>L</m:t>
-          </m:r>
-          <m:sSub>
-            <m:e>
-              <m:r>
-                <m:t>N</m:t>
-              </m:r>
-            </m:e>
-            <m:sub>
-              <m:r>
-                <m:rPr>
-                  <m:nor/>
-                  <m:sty m:val="p"/>
-                </m:rPr>
-                <m:t>KV</m:t>
-              </m:r>
-            </m:sub>
-          </m:sSub>
-          <m:sSub>
-            <m:e>
-              <m:r>
-                <m:t>D</m:t>
-              </m:r>
-            </m:e>
-            <m:sub>
-              <m:r>
-                <m:rPr>
-                  <m:nor/>
-                  <m:sty m:val="p"/>
-                </m:rPr>
-                <m:t>head</m:t>
-              </m:r>
-            </m:sub>
-          </m:sSub>
-          <m:sSub>
-            <m:e>
-              <m:r>
-                <m:t>b</m:t>
-              </m:r>
-            </m:e>
-            <m:sub>
-              <m:r>
-                <m:t>k</m:t>
-              </m:r>
-              <m:r>
-                <m:t>v</m:t>
-              </m:r>
-            </m:sub>
-          </m:sSub>
-        </m:oMath>
-      </m:oMathPara>
-    </w:p>
-    <w:p>
-      <w:pPr>
-        <w:pStyle w:val="FirstParagraph"/>
-      </w:pPr>
-      <w:r>
-        <w:t xml:space="preserve">并发请求驻留长度为</w:t>
-      </w:r>
-      <w:r>
-        <w:t xml:space="preserve"> </w:t>
-      </w:r>
-      <m:oMath>
-        <m:sSub>
-          <m:e>
-            <m:r>
-              <m:rPr>
-                <m:sty m:val="p"/>
-              </m:rPr>
-              <m:t>ℓ</m:t>
-            </m:r>
-          </m:e>
-          <m:sub>
-            <m:r>
-              <m:t>i</m:t>
-            </m:r>
-          </m:sub>
-        </m:sSub>
-      </m:oMath>
-      <w:r>
-        <w:t xml:space="preserve">：</w:t>
-      </w:r>
-    </w:p>
-    <w:p>
-      <w:pPr>
-        <w:pStyle w:val="BodyText"/>
-      </w:pPr>
-      <m:oMathPara>
-        <m:oMathParaPr>
-          <m:jc m:val="center"/>
-        </m:oMathParaPr>
-        <m:oMath>
-          <m:sSub>
-            <m:e>
-              <m:r>
-                <m:t>M</m:t>
-              </m:r>
-            </m:e>
-            <m:sub>
-              <m:r>
-                <m:rPr>
-                  <m:nor/>
-                  <m:sty m:val="p"/>
-                </m:rPr>
-                <m:t>KV,total</m:t>
-              </m:r>
-            </m:sub>
-          </m:sSub>
-          <m:r>
-            <m:rPr>
-              <m:sty m:val="p"/>
-            </m:rPr>
-            <m:t>=</m:t>
-          </m:r>
-          <m:sSub>
-            <m:e>
-              <m:r>
-                <m:t>m</m:t>
-              </m:r>
-            </m:e>
-            <m:sub>
-              <m:r>
-                <m:rPr>
-                  <m:nor/>
-                  <m:sty m:val="p"/>
-                </m:rPr>
-                <m:t>KV/token</m:t>
-              </m:r>
-            </m:sub>
-          </m:sSub>
-          <m:nary>
-            <m:naryPr>
-              <m:chr m:val="∑"/>
-              <m:limLoc m:val="undOvr"/>
-              <m:subHide m:val="off"/>
-              <m:supHide m:val="off"/>
-            </m:naryPr>
-            <m:sub>
-              <m:r>
-                <m:t>i</m:t>
-              </m:r>
-              <m:r>
-                <m:rPr>
-                  <m:sty m:val="p"/>
-                </m:rPr>
-                <m:t>=</m:t>
-              </m:r>
-              <m:r>
-                <m:t>1</m:t>
-              </m:r>
-            </m:sub>
-            <m:sup>
-              <m:r>
-                <m:t>C</m:t>
-              </m:r>
-            </m:sup>
-            <m:e>
-              <m:sSub>
-                <m:e>
-                  <m:r>
-                    <m:rPr>
-                      <m:sty m:val="p"/>
-                    </m:rPr>
-                    <m:t>ℓ</m:t>
-                  </m:r>
-                </m:e>
-                <m:sub>
-                  <m:r>
-                    <m:t>i</m:t>
-                  </m:r>
-                </m:sub>
-              </m:sSub>
-            </m:e>
-          </m:nary>
+          <m:m>
+            <m:mPr>
+              <m:baseJc m:val="center"/>
+              <m:plcHide m:val="on"/>
+              <m:mcs>
+                <m:mc>
+                  <m:mcPr>
+                    <m:mcJc m:val="right"/>
+                    <m:count m:val="1"/>
+                  </m:mcPr>
+                </m:mc>
+                <m:mc>
+                  <m:mcPr>
+                    <m:mcJc m:val="left"/>
+                    <m:count m:val="1"/>
+                  </m:mcPr>
+                </m:mc>
+              </m:mcs>
+            </m:mPr>
+            <m:mr>
+              <m:e>
+                <m:sSub>
+                  <m:e>
+                    <m:r>
+                      <m:t>m</m:t>
+                    </m:r>
+                  </m:e>
+                  <m:sub>
+                    <m:r>
+                      <m:rPr>
+                        <m:nor/>
+                        <m:sty m:val="p"/>
+                      </m:rPr>
+                      <m:t>KV/token</m:t>
+                    </m:r>
+                  </m:sub>
+                </m:sSub>
+              </m:e>
+              <m:e>
+                <m:r>
+                  <m:rPr>
+                    <m:sty m:val="p"/>
+                  </m:rPr>
+                  <m:t>=</m:t>
+                </m:r>
+                <m:r>
+                  <m:t>2</m:t>
+                </m:r>
+                <m:r>
+                  <m:t>L</m:t>
+                </m:r>
+                <m:sSub>
+                  <m:e>
+                    <m:r>
+                      <m:t>N</m:t>
+                    </m:r>
+                  </m:e>
+                  <m:sub>
+                    <m:r>
+                      <m:rPr>
+                        <m:nor/>
+                        <m:sty m:val="p"/>
+                      </m:rPr>
+                      <m:t>KV</m:t>
+                    </m:r>
+                  </m:sub>
+                </m:sSub>
+                <m:sSub>
+                  <m:e>
+                    <m:r>
+                      <m:t>D</m:t>
+                    </m:r>
+                  </m:e>
+                  <m:sub>
+                    <m:r>
+                      <m:rPr>
+                        <m:nor/>
+                        <m:sty m:val="p"/>
+                      </m:rPr>
+                      <m:t>head</m:t>
+                    </m:r>
+                  </m:sub>
+                </m:sSub>
+                <m:sSub>
+                  <m:e>
+                    <m:r>
+                      <m:t>b</m:t>
+                    </m:r>
+                  </m:e>
+                  <m:sub>
+                    <m:r>
+                      <m:t>k</m:t>
+                    </m:r>
+                    <m:r>
+                      <m:t>v</m:t>
+                    </m:r>
+                  </m:sub>
+                </m:sSub>
+                <m:r>
+                  <m:rPr>
+                    <m:sty m:val="p"/>
+                  </m:rPr>
+                  <m:t>,</m:t>
+                </m:r>
+              </m:e>
+            </m:mr>
+            <m:mr>
+              <m:e>
+                <m:sSub>
+                  <m:e>
+                    <m:r>
+                      <m:t>M</m:t>
+                    </m:r>
+                  </m:e>
+                  <m:sub>
+                    <m:r>
+                      <m:rPr>
+                        <m:nor/>
+                        <m:sty m:val="p"/>
+                      </m:rPr>
+                      <m:t>KV,total</m:t>
+                    </m:r>
+                  </m:sub>
+                </m:sSub>
+              </m:e>
+              <m:e>
+                <m:r>
+                  <m:rPr>
+                    <m:sty m:val="p"/>
+                  </m:rPr>
+                  <m:t>=</m:t>
+                </m:r>
+                <m:sSub>
+                  <m:e>
+                    <m:r>
+                      <m:t>m</m:t>
+                    </m:r>
+                  </m:e>
+                  <m:sub>
+                    <m:r>
+                      <m:rPr>
+                        <m:nor/>
+                        <m:sty m:val="p"/>
+                      </m:rPr>
+                      <m:t>KV/token</m:t>
+                    </m:r>
+                  </m:sub>
+                </m:sSub>
+                <m:nary>
+                  <m:naryPr>
+                    <m:chr m:val="∑"/>
+                    <m:limLoc m:val="undOvr"/>
+                    <m:subHide m:val="off"/>
+                    <m:supHide m:val="off"/>
+                  </m:naryPr>
+                  <m:sub>
+                    <m:r>
+                      <m:t>i</m:t>
+                    </m:r>
+                    <m:r>
+                      <m:rPr>
+                        <m:sty m:val="p"/>
+                      </m:rPr>
+                      <m:t>=</m:t>
+                    </m:r>
+                    <m:r>
+                      <m:t>1</m:t>
+                    </m:r>
+                  </m:sub>
+                  <m:sup>
+                    <m:r>
+                      <m:t>C</m:t>
+                    </m:r>
+                  </m:sup>
+                  <m:e>
+                    <m:sSub>
+                      <m:e>
+                        <m:r>
+                          <m:rPr>
+                            <m:sty m:val="p"/>
+                          </m:rPr>
+                          <m:t>ℓ</m:t>
+                        </m:r>
+                      </m:e>
+                      <m:sub>
+                        <m:r>
+                          <m:t>i</m:t>
+                        </m:r>
+                      </m:sub>
+                    </m:sSub>
+                  </m:e>
+                </m:nary>
+              </m:e>
+            </m:mr>
+          </m:m>
         </m:oMath>
       </m:oMathPara>
     </w:p>
@@ -3121,105 +3138,7 @@
         <w:pStyle w:val="FirstParagraph"/>
       </w:pPr>
       <w:r>
-        <w:t xml:space="preserve">PD分离将Prefill和Decode部署到不同资源池。单请求Prompt KV传输量为：</w:t>
-      </w:r>
-    </w:p>
-    <w:p>
-      <w:pPr>
-        <w:pStyle w:val="BodyText"/>
-      </w:pPr>
-      <m:oMathPara>
-        <m:oMathParaPr>
-          <m:jc m:val="center"/>
-        </m:oMathParaPr>
-        <m:oMath>
-          <m:sSub>
-            <m:e>
-              <m:r>
-                <m:t>D</m:t>
-              </m:r>
-            </m:e>
-            <m:sub>
-              <m:r>
-                <m:rPr>
-                  <m:nor/>
-                  <m:sty m:val="p"/>
-                </m:rPr>
-                <m:t>KV</m:t>
-              </m:r>
-            </m:sub>
-          </m:sSub>
-          <m:r>
-            <m:rPr>
-              <m:sty m:val="p"/>
-            </m:rPr>
-            <m:t>=</m:t>
-          </m:r>
-          <m:r>
-            <m:t>2</m:t>
-          </m:r>
-          <m:r>
-            <m:t>L</m:t>
-          </m:r>
-          <m:r>
-            <m:t>S</m:t>
-          </m:r>
-          <m:sSub>
-            <m:e>
-              <m:r>
-                <m:t>N</m:t>
-              </m:r>
-            </m:e>
-            <m:sub>
-              <m:r>
-                <m:rPr>
-                  <m:nor/>
-                  <m:sty m:val="p"/>
-                </m:rPr>
-                <m:t>KV</m:t>
-              </m:r>
-            </m:sub>
-          </m:sSub>
-          <m:sSub>
-            <m:e>
-              <m:r>
-                <m:t>D</m:t>
-              </m:r>
-            </m:e>
-            <m:sub>
-              <m:r>
-                <m:rPr>
-                  <m:nor/>
-                  <m:sty m:val="p"/>
-                </m:rPr>
-                <m:t>head</m:t>
-              </m:r>
-            </m:sub>
-          </m:sSub>
-          <m:sSub>
-            <m:e>
-              <m:r>
-                <m:t>b</m:t>
-              </m:r>
-            </m:e>
-            <m:sub>
-              <m:r>
-                <m:t>k</m:t>
-              </m:r>
-              <m:r>
-                <m:t>v</m:t>
-              </m:r>
-            </m:sub>
-          </m:sSub>
-        </m:oMath>
-      </m:oMathPara>
-    </w:p>
-    <w:p>
-      <w:pPr>
-        <w:pStyle w:val="FirstParagraph"/>
-      </w:pPr>
-      <w:r>
-        <w:t xml:space="preserve">请求到达率为</w:t>
+        <w:t xml:space="preserve">PD分离将Prefill和Decode部署到不同资源池。请求到达率为</w:t>
       </w:r>
       <w:r>
         <w:t xml:space="preserve"> </w:t>
@@ -3266,92 +3185,208 @@
           <m:jc m:val="center"/>
         </m:oMathParaPr>
         <m:oMath>
-          <m:r>
-            <m:t>B</m:t>
-          </m:r>
-          <m:sSub>
-            <m:e>
-              <m:r>
-                <m:t>W</m:t>
-              </m:r>
-            </m:e>
-            <m:sub>
-              <m:r>
-                <m:rPr>
-                  <m:nor/>
-                  <m:sty m:val="p"/>
-                </m:rPr>
-                <m:t>PD</m:t>
-              </m:r>
-            </m:sub>
-          </m:sSub>
-          <m:r>
-            <m:rPr>
-              <m:sty m:val="p"/>
-            </m:rPr>
-            <m:t>≥</m:t>
-          </m:r>
-          <m:f>
-            <m:fPr>
-              <m:type m:val="bar"/>
-            </m:fPr>
-            <m:num>
-              <m:r>
-                <m:t>λ</m:t>
-              </m:r>
-              <m:r>
-                <m:rPr>
-                  <m:sty m:val="p"/>
-                  <m:scr m:val="double-struck"/>
-                </m:rPr>
-                <m:t>E</m:t>
-              </m:r>
-              <m:d>
-                <m:dPr>
-                  <m:begChr m:val="["/>
-                  <m:endChr m:val="]"/>
-                  <m:sepChr m:val=""/>
-                  <m:grow/>
-                </m:dPr>
-                <m:e>
-                  <m:sSub>
-                    <m:e>
-                      <m:r>
-                        <m:t>D</m:t>
-                      </m:r>
-                    </m:e>
-                    <m:sub>
-                      <m:r>
-                        <m:rPr>
-                          <m:nor/>
-                          <m:sty m:val="p"/>
-                        </m:rPr>
-                        <m:t>wire</m:t>
-                      </m:r>
-                    </m:sub>
-                  </m:sSub>
-                </m:e>
-              </m:d>
-            </m:num>
-            <m:den>
-              <m:sSub>
-                <m:e>
-                  <m:r>
-                    <m:t>η</m:t>
-                  </m:r>
-                </m:e>
-                <m:sub>
-                  <m:r>
-                    <m:rPr>
-                      <m:nor/>
-                      <m:sty m:val="p"/>
-                    </m:rPr>
-                    <m:t>network</m:t>
-                  </m:r>
-                </m:sub>
-              </m:sSub>
-            </m:den>
-          </m:f>
+          <m:m>
+            <m:mPr>
+              <m:baseJc m:val="center"/>
+              <m:plcHide m:val="on"/>
+              <m:mcs>
+                <m:mc>
+                  <m:mcPr>
+                    <m:mcJc m:val="right"/>
+                    <m:count m:val="1"/>
+                  </m:mcPr>
+                </m:mc>
+                <m:mc>
+                  <m:mcPr>
+                    <m:mcJc m:val="left"/>
+                    <m:count m:val="1"/>
+                  </m:mcPr>
+                </m:mc>
+              </m:mcs>
+            </m:mPr>
+            <m:mr>
+              <m:e>
+                <m:sSub>
+                  <m:e>
+                    <m:r>
+                      <m:t>D</m:t>
+                    </m:r>
+                  </m:e>
+                  <m:sub>
+                    <m:r>
+                      <m:rPr>
+                        <m:nor/>
+                        <m:sty m:val="p"/>
+                      </m:rPr>
+                      <m:t>KV</m:t>
+                    </m:r>
+                  </m:sub>
+                </m:sSub>
+              </m:e>
+              <m:e>
+                <m:r>
+                  <m:rPr>
+                    <m:sty m:val="p"/>
+                  </m:rPr>
+                  <m:t>=</m:t>
+                </m:r>
+                <m:r>
+                  <m:t>2</m:t>
+                </m:r>
+                <m:r>
+                  <m:t>L</m:t>
+                </m:r>
+                <m:r>
+                  <m:t>S</m:t>
+                </m:r>
+                <m:sSub>
+                  <m:e>
+                    <m:r>
+                      <m:t>N</m:t>
+                    </m:r>
+                  </m:e>
+                  <m:sub>
+                    <m:r>
+                      <m:rPr>
+                        <m:nor/>
+                        <m:sty m:val="p"/>
+                      </m:rPr>
+                      <m:t>KV</m:t>
+                    </m:r>
+                  </m:sub>
+                </m:sSub>
+                <m:sSub>
+                  <m:e>
+                    <m:r>
+                      <m:t>D</m:t>
+                    </m:r>
+                  </m:e>
+                  <m:sub>
+                    <m:r>
+                      <m:rPr>
+                        <m:nor/>
+                        <m:sty m:val="p"/>
+                      </m:rPr>
+                      <m:t>head</m:t>
+                    </m:r>
+                  </m:sub>
+                </m:sSub>
+                <m:sSub>
+                  <m:e>
+                    <m:r>
+                      <m:t>b</m:t>
+                    </m:r>
+                  </m:e>
+                  <m:sub>
+                    <m:r>
+                      <m:t>k</m:t>
+                    </m:r>
+                    <m:r>
+                      <m:t>v</m:t>
+                    </m:r>
+                  </m:sub>
+                </m:sSub>
+                <m:r>
+                  <m:rPr>
+                    <m:sty m:val="p"/>
+                  </m:rPr>
+                  <m:t>,</m:t>
+                </m:r>
+              </m:e>
+            </m:mr>
+            <m:mr>
+              <m:e>
+                <m:r>
+                  <m:t>B</m:t>
+                </m:r>
+                <m:sSub>
+                  <m:e>
+                    <m:r>
+                      <m:t>W</m:t>
+                    </m:r>
+                  </m:e>
+                  <m:sub>
+                    <m:r>
+                      <m:rPr>
+                        <m:nor/>
+                        <m:sty m:val="p"/>
+                      </m:rPr>
+                      <m:t>PD</m:t>
+                    </m:r>
+                  </m:sub>
+                </m:sSub>
+              </m:e>
+              <m:e>
+                <m:r>
+                  <m:rPr>
+                    <m:sty m:val="p"/>
+                  </m:rPr>
+                  <m:t>≥</m:t>
+                </m:r>
+                <m:f>
+                  <m:fPr>
+                    <m:type m:val="bar"/>
+                  </m:fPr>
+                  <m:num>
+                    <m:r>
+                      <m:t>λ</m:t>
+                    </m:r>
+                    <m:r>
+                      <m:rPr>
+                        <m:sty m:val="p"/>
+                        <m:scr m:val="double-struck"/>
+                      </m:rPr>
+                      <m:t>E</m:t>
+                    </m:r>
+                    <m:d>
+                      <m:dPr>
+                        <m:begChr m:val="["/>
+                        <m:endChr m:val="]"/>
+                        <m:sepChr m:val=""/>
+                        <m:grow/>
+                      </m:dPr>
+                      <m:e>
+                        <m:sSub>
+                          <m:e>
+                            <m:r>
+                              <m:t>D</m:t>
+                            </m:r>
+                          </m:e>
+                          <m:sub>
+                            <m:r>
+                              <m:rPr>
+                                <m:nor/>
+                                <m:sty m:val="p"/>
+                              </m:rPr>
+                              <m:t>wire</m:t>
+                            </m:r>
+                          </m:sub>
+                        </m:sSub>
+                      </m:e>
+                    </m:d>
+                  </m:num>
+                  <m:den>
+                    <m:sSub>
+                      <m:e>
+                        <m:r>
+                          <m:t>η</m:t>
+                        </m:r>
+                      </m:e>
+                      <m:sub>
+                        <m:r>
+                          <m:rPr>
+                            <m:nor/>
+                            <m:sty m:val="p"/>
+                          </m:rPr>
+                          <m:t>network</m:t>
+                        </m:r>
+                      </m:sub>
+                    </m:sSub>
+                  </m:den>
+                </m:f>
+              </m:e>
+            </m:mr>
+          </m:m>
         </m:oMath>
       </m:oMathPara>
     </w:p>
@@ -4099,7 +4134,7 @@
         <w:pStyle w:val="Compact"/>
       </w:pPr>
       <w:r>
-        <w:t xml:space="preserve">90%参数为可由EP切分的专家参数；</w:t>
+        <w:t xml:space="preserve">97.5%参数为Routed Expert，2.5%为非专家参数，该比例代入式（1）得到约37.2B激活参数；</w:t>
       </w:r>
     </w:p>
     <w:p>
@@ -4111,7 +4146,86 @@
         <w:pStyle w:val="Compact"/>
       </w:pPr>
       <w:r>
-        <w:t xml:space="preserve">10%参数可按TP×PP切分；</w:t>
+        <w:t xml:space="preserve">Routed Expert按</w:t>
+      </w:r>
+      <w:r>
+        <w:t xml:space="preserve"> </w:t>
+      </w:r>
+      <m:oMath>
+        <m:r>
+          <m:t>T</m:t>
+        </m:r>
+        <m:sSub>
+          <m:e>
+            <m:r>
+              <m:t>P</m:t>
+            </m:r>
+          </m:e>
+          <m:sub>
+            <m:r>
+              <m:t>x</m:t>
+            </m:r>
+          </m:sub>
+        </m:sSub>
+        <m:r>
+          <m:rPr>
+            <m:sty m:val="p"/>
+          </m:rPr>
+          <m:t>×</m:t>
+        </m:r>
+        <m:r>
+          <m:t>E</m:t>
+        </m:r>
+        <m:r>
+          <m:t>P</m:t>
+        </m:r>
+        <m:r>
+          <m:rPr>
+            <m:sty m:val="p"/>
+          </m:rPr>
+          <m:t>×</m:t>
+        </m:r>
+        <m:r>
+          <m:t>P</m:t>
+        </m:r>
+        <m:r>
+          <m:t>P</m:t>
+        </m:r>
+      </m:oMath>
+      <w:r>
+        <w:t xml:space="preserve"> </w:t>
+      </w:r>
+      <w:r>
+        <w:t xml:space="preserve">切分，非专家参数按</w:t>
+      </w:r>
+      <w:r>
+        <w:t xml:space="preserve"> </w:t>
+      </w:r>
+      <m:oMath>
+        <m:r>
+          <m:t>T</m:t>
+        </m:r>
+        <m:r>
+          <m:t>P</m:t>
+        </m:r>
+        <m:r>
+          <m:rPr>
+            <m:sty m:val="p"/>
+          </m:rPr>
+          <m:t>×</m:t>
+        </m:r>
+        <m:r>
+          <m:t>P</m:t>
+        </m:r>
+        <m:r>
+          <m:t>P</m:t>
+        </m:r>
+      </m:oMath>
+      <w:r>
+        <w:t xml:space="preserve"> </w:t>
+      </w:r>
+      <w:r>
+        <w:t xml:space="preserve">切分；</w:t>
       </w:r>
     </w:p>
     <w:p>
@@ -4123,6 +4237,27 @@
         <w:pStyle w:val="Compact"/>
       </w:pPr>
       <m:oMath>
+        <m:r>
+          <m:t>T</m:t>
+        </m:r>
+        <m:sSub>
+          <m:e>
+            <m:r>
+              <m:t>P</m:t>
+            </m:r>
+          </m:e>
+          <m:sub>
+            <m:r>
+              <m:t>x</m:t>
+            </m:r>
+          </m:sub>
+        </m:sSub>
+        <m:r>
+          <m:rPr>
+            <m:sty m:val="p"/>
+          </m:rPr>
+          <m:t>=</m:t>
+        </m:r>
         <m:r>
           <m:t>T</m:t>
         </m:r>
@@ -4194,7 +4329,7 @@
         <w:pStyle w:val="Compact"/>
       </w:pPr>
       <w:r>
-        <w:t xml:space="preserve">每Rank预留20 GB；</w:t>
+        <w:t xml:space="preserve">85%规划容量内再为Activation、通信和Workspace预留20 GB；</w:t>
       </w:r>
     </w:p>
     <w:p>
@@ -4214,76 +4349,72 @@
         <w:pStyle w:val="FirstParagraph"/>
       </w:pPr>
       <w:r>
-        <w:t xml:space="preserve">训练状态总量约为：</w:t>
+        <w:t xml:space="preserve">训练状态总量约为</w:t>
+      </w:r>
+      <w:r>
+        <w:t xml:space="preserve"> </w:t>
+      </w:r>
+      <m:oMath>
+        <m:r>
+          <m:t>671</m:t>
+        </m:r>
+        <m:r>
+          <m:rPr>
+            <m:sty m:val="p"/>
+          </m:rPr>
+          <m:t>×</m:t>
+        </m:r>
+        <m:sSup>
+          <m:e>
+            <m:r>
+              <m:t>10</m:t>
+            </m:r>
+          </m:e>
+          <m:sup>
+            <m:r>
+              <m:t>9</m:t>
+            </m:r>
+          </m:sup>
+        </m:sSup>
+        <m:r>
+          <m:rPr>
+            <m:sty m:val="p"/>
+          </m:rPr>
+          <m:t>×</m:t>
+        </m:r>
+        <m:r>
+          <m:t>16</m:t>
+        </m:r>
+        <m:r>
+          <m:rPr>
+            <m:sty m:val="p"/>
+          </m:rPr>
+          <m:t>=</m:t>
+        </m:r>
+        <m:r>
+          <m:t>10.736</m:t>
+        </m:r>
+        <m:r>
+          <m:t> </m:t>
+        </m:r>
+        <m:r>
+          <m:rPr>
+            <m:nor/>
+            <m:sty m:val="p"/>
+          </m:rPr>
+          <m:t>TB</m:t>
+        </m:r>
+      </m:oMath>
+      <w:r>
+        <w:t xml:space="preserve">。</w:t>
       </w:r>
     </w:p>
     <w:p>
       <w:pPr>
         <w:pStyle w:val="BodyText"/>
       </w:pPr>
-      <m:oMathPara>
-        <m:oMathParaPr>
-          <m:jc m:val="center"/>
-        </m:oMathParaPr>
-        <m:oMath>
-          <m:r>
-            <m:t>671</m:t>
-          </m:r>
-          <m:r>
-            <m:rPr>
-              <m:sty m:val="p"/>
-            </m:rPr>
-            <m:t>×</m:t>
-          </m:r>
-          <m:sSup>
-            <m:e>
-              <m:r>
-                <m:t>10</m:t>
-              </m:r>
-            </m:e>
-            <m:sup>
-              <m:r>
-                <m:t>9</m:t>
-              </m:r>
-            </m:sup>
-          </m:sSup>
-          <m:r>
-            <m:rPr>
-              <m:sty m:val="p"/>
-            </m:rPr>
-            <m:t>×</m:t>
-          </m:r>
-          <m:r>
-            <m:t>16</m:t>
-          </m:r>
-          <m:r>
-            <m:rPr>
-              <m:sty m:val="p"/>
-            </m:rPr>
-            <m:t>=</m:t>
-          </m:r>
-          <m:r>
-            <m:t>10.736</m:t>
-          </m:r>
-          <m:r>
-            <m:t> </m:t>
-          </m:r>
-          <m:r>
-            <m:rPr>
-              <m:nor/>
-              <m:sty m:val="p"/>
-            </m:rPr>
-            <m:t>TB</m:t>
-          </m:r>
-        </m:oMath>
-      </m:oMathPara>
-    </w:p>
-    <w:p>
-      <w:pPr>
-        <w:pStyle w:val="FirstParagraph"/>
-      </w:pPr>
-      <w:r>
-        <w:t xml:space="preserve">在上述参数拆分假设下，每Rank训练状态约76.5 GB，加20 GB预留后约96.5 GB，低于122.4 GB规划容量。完整模型并行组为1024 Rank，每个PP Stage内的高频TP×EP域为128 Rank。</w:t>
+      <w:r>
+        <w:t xml:space="preserve">在上述参数拆分假设下，每RankRouted Expert状态约10.2 GB，非专家状态约16.8 GB，训练状态合计约27.0 GB；加20 GB负载预留后约47.0 GB，低于122.4 GB规划容量。HBM剩余15%作为系统安全余量，与20 GB负载预留分属两层。完整模型并行组为1024 Rank，每个PP Stage内的高频TP×EP域为128 Rank。</w:t>
       </w:r>
     </w:p>
     <w:p>
@@ -4377,7 +4508,7 @@
         <w:pStyle w:val="FirstParagraph"/>
       </w:pPr>
       <w:r>
-        <w:t xml:space="preserve">每Token KV为256 KiB，单请求KV为32 GiB，16并发逻辑KV约512 GiB。权重与KV合计约950 GB，按单NPU规划可用122.4 GB计算，逻辑聚合容量下界为8 Rank。</w:t>
+        <w:t xml:space="preserve">每Token KV为256 KiB，单请求KV为32 GiB，16并发逻辑KV约512 GiB，即约550 GB。权重与KV合计约950 GB，按单NPU规划可用122.4 GB计算，逻辑聚合容量下界为8 Rank。</w:t>
       </w:r>
     </w:p>
     <w:p>
@@ -4393,70 +4524,79 @@
         <w:pStyle w:val="BodyText"/>
       </w:pPr>
       <w:r>
-        <w:t xml:space="preserve">按每秒2个完整Prompt进入Decode池、网络有效效率70%计算，平均PD KV带宽需求约：</w:t>
-      </w:r>
-    </w:p>
-    <w:p>
-      <w:pPr>
-        <w:pStyle w:val="BodyText"/>
-      </w:pPr>
-      <m:oMathPara>
-        <m:oMathParaPr>
-          <m:jc m:val="center"/>
-        </m:oMathParaPr>
-        <m:oMath>
-          <m:f>
-            <m:fPr>
-              <m:type m:val="bar"/>
-            </m:fPr>
-            <m:num>
-              <m:r>
-                <m:t>2</m:t>
-              </m:r>
-              <m:r>
-                <m:rPr>
-                  <m:sty m:val="p"/>
-                </m:rPr>
-                <m:t>×</m:t>
-              </m:r>
-              <m:r>
-                <m:t>32</m:t>
-              </m:r>
-            </m:num>
-            <m:den>
-              <m:r>
-                <m:t>0.7</m:t>
-              </m:r>
-            </m:den>
-          </m:f>
-          <m:r>
-            <m:rPr>
-              <m:sty m:val="p"/>
-            </m:rPr>
-            <m:t>≈</m:t>
-          </m:r>
-          <m:r>
-            <m:t>91.4</m:t>
-          </m:r>
-          <m:r>
-            <m:t> </m:t>
-          </m:r>
-          <m:r>
-            <m:rPr>
-              <m:nor/>
-              <m:sty m:val="p"/>
-            </m:rPr>
-            <m:t>GiB/s</m:t>
-          </m:r>
-        </m:oMath>
-      </m:oMathPara>
-    </w:p>
-    <w:p>
-      <w:pPr>
-        <w:pStyle w:val="FirstParagraph"/>
-      </w:pPr>
-      <w:r>
-        <w:t xml:space="preserve">该值不含TP重排、协议开销和短时突发，不能直接与2 TB/s芯片互联峰值作性能结论。</w:t>
+        <w:t xml:space="preserve">按每秒2个完整Prompt进入Decode池、网络有效效率70%计算，平均名义PD KV带宽下界约为</w:t>
+      </w:r>
+      <w:r>
+        <w:t xml:space="preserve"> </w:t>
+      </w:r>
+      <m:oMath>
+        <m:r>
+          <m:t>2</m:t>
+        </m:r>
+        <m:r>
+          <m:rPr>
+            <m:sty m:val="p"/>
+          </m:rPr>
+          <m:t>×</m:t>
+        </m:r>
+        <m:r>
+          <m:t>32</m:t>
+        </m:r>
+        <m:r>
+          <m:rPr>
+            <m:sty m:val="p"/>
+          </m:rPr>
+          <m:t>/</m:t>
+        </m:r>
+        <m:r>
+          <m:t>0.7</m:t>
+        </m:r>
+        <m:r>
+          <m:rPr>
+            <m:sty m:val="p"/>
+          </m:rPr>
+          <m:t>≈</m:t>
+        </m:r>
+        <m:r>
+          <m:t>91.4</m:t>
+        </m:r>
+        <m:r>
+          <m:t> </m:t>
+        </m:r>
+        <m:r>
+          <m:rPr>
+            <m:nor/>
+            <m:sty m:val="p"/>
+          </m:rPr>
+          <m:t>GiB/s</m:t>
+        </m:r>
+      </m:oMath>
+      <w:r>
+        <w:t xml:space="preserve">。该值使用逻辑KV而非完整</w:t>
+      </w:r>
+      <w:r>
+        <w:t xml:space="preserve"> </w:t>
+      </w:r>
+      <m:oMath>
+        <m:sSub>
+          <m:e>
+            <m:r>
+              <m:t>D</m:t>
+            </m:r>
+          </m:e>
+          <m:sub>
+            <m:r>
+              <m:rPr>
+                <m:nor/>
+                <m:sty m:val="p"/>
+              </m:rPr>
+              <m:t>wire</m:t>
+            </m:r>
+          </m:sub>
+        </m:sSub>
+      </m:oMath>
+      <w:r>
+        <w:t xml:space="preserve">，不含TP重排、协议开销和短时突发，不能直接与2 TB/s芯片互联峰值作性能结论。</w:t>
       </w:r>
     </w:p>
     <w:p>
@@ -5094,7 +5234,7 @@
     <w:bookmarkEnd w:id="52"/>
     <w:sectPr>
       <w:pgSz w:h="16838" w:w="11906"/>
-      <w:pgMar w:bottom="907" w:left="1020" w:right="1020" w:top="907"/>
+      <w:pgMar w:bottom="1020" w:left="1134" w:right="1134" w:top="1020"/>
     </w:sectPr>
   </w:body>
 </w:document>
@@ -5474,7 +5614,7 @@
     <w:name w:val="Normal"/>
     <w:qFormat/>
     <w:pPr>
-      <w:spacing w:after="60" w:line="252" w:lineRule="auto"/>
+      <w:spacing w:after="80" w:line="259" w:lineRule="auto"/>
     </w:pPr>
     <w:rPr>
       <w:rFonts w:ascii="Arial" w:eastAsia="Microsoft YaHei" w:hAnsi="Arial"/>

</xml_diff>

<commit_message>
docs: clarify MoE brief memory reserve accounting
Co-authored-by: Tao Gao <taogao1991@outlook.com>
</commit_message>
<xml_diff>
--- a/docs/supernode-scale/稀疏模型超节点规模需求分析_精华版.docx
+++ b/docs/supernode-scale/稀疏模型超节点规模需求分析_精华版.docx
@@ -1570,7 +1570,28 @@
         </m:sSub>
       </m:oMath>
       <w:r>
-        <w:t xml:space="preserve">用于预留通信Buffer、Runtime Workspace、分页碎片和峰值临时内存。聚合容量下界只用于排除过小方案，实际布局还需满足TP、EP、CP和PP的整除及复制约束。</w:t>
+        <w:t xml:space="preserve">用于保留系统不可分配空间、框架保守水位和未建模峰值；</w:t>
+      </w:r>
+      <m:oMath>
+        <m:sSub>
+          <m:e>
+            <m:r>
+              <m:t>M</m:t>
+            </m:r>
+          </m:e>
+          <m:sub>
+            <m:r>
+              <m:rPr>
+                <m:nor/>
+                <m:sty m:val="p"/>
+              </m:rPr>
+              <m:t>total</m:t>
+            </m:r>
+          </m:sub>
+        </m:sSub>
+      </m:oMath>
+      <w:r>
+        <w:t xml:space="preserve">仍需显式计入Activation、通信Buffer和Runtime Workspace。聚合容量下界只用于排除过小方案，实际布局还需满足TP、EP、CP和PP的整除及复制约束。</w:t>
       </w:r>
     </w:p>
     <w:bookmarkEnd w:id="22"/>

</xml_diff>